<commit_message>
code commit using new git token
</commit_message>
<xml_diff>
--- a/Kubernetes_Tutorials/Kubernetes_Train_With_Shubham.docx
+++ b/Kubernetes_Tutorials/Kubernetes_Train_With_Shubham.docx
@@ -34,7 +34,8 @@
       </w:r>
       <w:r>
         <w:rPr>
-          <w:lang w:val="en-US"/>
+          <w:noProof/>
+          <w:lang w:eastAsia="en-IN"/>
         </w:rPr>
         <w:drawing>
           <wp:inline distT="0" distB="0" distL="0" distR="0" wp14:anchorId="49E6C929" wp14:editId="1D807329">
@@ -126,37 +127,503 @@
         </w:rPr>
         <w:br/>
       </w:r>
-    </w:p>
-    <w:p>
-      <w:pPr>
-        <w:rPr>
-          <w:lang w:val="en-US"/>
-        </w:rPr>
-      </w:pPr>
-    </w:p>
-    <w:p>
-      <w:pPr>
-        <w:rPr>
-          <w:lang w:val="en-US"/>
-        </w:rPr>
-      </w:pPr>
-    </w:p>
-    <w:p>
-      <w:pPr>
-        <w:rPr>
-          <w:lang w:val="en-US"/>
-        </w:rPr>
-      </w:pPr>
-      <w:proofErr w:type="gramStart"/>
+      <w:r>
+        <w:rPr>
+          <w:lang w:val="en-US"/>
+        </w:rPr>
+        <w:br/>
+      </w:r>
       <w:r>
         <w:rPr>
           <w:lang w:val="en-US"/>
         </w:rPr>
         <w:t>-----------------------------------  END</w:t>
+      </w:r>
+      <w:r>
+        <w:rPr>
+          <w:lang w:val="en-US"/>
+        </w:rPr>
+        <w:br/>
+      </w:r>
+      <w:r>
+        <w:rPr>
+          <w:lang w:val="en-US"/>
+        </w:rPr>
+        <w:br/>
+        <w:t>----------------------------   28/01/2026 ----  START ---------------------------</w:t>
+      </w:r>
+      <w:r>
+        <w:rPr>
+          <w:lang w:val="en-US"/>
+        </w:rPr>
+        <w:br/>
+        <w:t xml:space="preserve">There are two main node in </w:t>
+      </w:r>
+      <w:proofErr w:type="spellStart"/>
+      <w:r>
+        <w:rPr>
+          <w:lang w:val="en-US"/>
+        </w:rPr>
+        <w:t>kubernetes</w:t>
+      </w:r>
+      <w:proofErr w:type="spellEnd"/>
+      <w:r>
+        <w:rPr>
+          <w:lang w:val="en-US"/>
+        </w:rPr>
+        <w:t xml:space="preserve">. 1.) </w:t>
+      </w:r>
+      <w:r>
+        <w:rPr>
+          <w:b/>
+          <w:lang w:val="en-US"/>
+        </w:rPr>
+        <w:t>Master Node</w:t>
+      </w:r>
+      <w:r>
+        <w:rPr>
+          <w:lang w:val="en-US"/>
+        </w:rPr>
+        <w:t xml:space="preserve">- It is the node which contains </w:t>
+      </w:r>
+      <w:proofErr w:type="spellStart"/>
+      <w:r>
+        <w:rPr>
+          <w:lang w:val="en-US"/>
+        </w:rPr>
+        <w:t>Schedular</w:t>
+      </w:r>
+      <w:proofErr w:type="spellEnd"/>
+      <w:r>
+        <w:rPr>
+          <w:lang w:val="en-US"/>
+        </w:rPr>
+        <w:t xml:space="preserve">, Controller Manager, API Server and </w:t>
+      </w:r>
+      <w:proofErr w:type="spellStart"/>
+      <w:r>
+        <w:rPr>
+          <w:lang w:val="en-US"/>
+        </w:rPr>
+        <w:t>etcd</w:t>
+      </w:r>
+      <w:proofErr w:type="spellEnd"/>
+      <w:r>
+        <w:rPr>
+          <w:lang w:val="en-US"/>
+        </w:rPr>
+        <w:t xml:space="preserve"> database. </w:t>
+      </w:r>
+      <w:r>
+        <w:rPr>
+          <w:lang w:val="en-US"/>
+        </w:rPr>
+        <w:br/>
+        <w:t xml:space="preserve">2.) </w:t>
+      </w:r>
+      <w:r>
+        <w:rPr>
+          <w:b/>
+          <w:lang w:val="en-US"/>
+        </w:rPr>
+        <w:t>Node</w:t>
+      </w:r>
+      <w:r>
+        <w:rPr>
+          <w:lang w:val="en-US"/>
+        </w:rPr>
+        <w:t xml:space="preserve"> </w:t>
+      </w:r>
+      <w:r>
+        <w:rPr>
+          <w:b/>
+          <w:lang w:val="en-US"/>
+        </w:rPr>
+        <w:t xml:space="preserve">– </w:t>
+      </w:r>
+      <w:r>
+        <w:rPr>
+          <w:lang w:val="en-US"/>
+        </w:rPr>
+        <w:t xml:space="preserve">It contains </w:t>
+      </w:r>
+      <w:proofErr w:type="spellStart"/>
+      <w:r>
+        <w:rPr>
+          <w:lang w:val="en-US"/>
+        </w:rPr>
+        <w:t>Kubelet</w:t>
+      </w:r>
+      <w:proofErr w:type="spellEnd"/>
+      <w:r>
+        <w:rPr>
+          <w:lang w:val="en-US"/>
+        </w:rPr>
+        <w:t xml:space="preserve">, Service proxy, and multiple pod, pods are the </w:t>
+      </w:r>
+      <w:proofErr w:type="spellStart"/>
+      <w:r>
+        <w:rPr>
+          <w:lang w:val="en-US"/>
+        </w:rPr>
+        <w:t>docker</w:t>
+      </w:r>
+      <w:proofErr w:type="spellEnd"/>
+      <w:r>
+        <w:rPr>
+          <w:lang w:val="en-US"/>
+        </w:rPr>
+        <w:t xml:space="preserve"> containers running in the node.</w:t>
+      </w:r>
+      <w:r>
+        <w:rPr>
+          <w:lang w:val="en-US"/>
+        </w:rPr>
+        <w:t xml:space="preserve"> </w:t>
+      </w:r>
+      <w:r>
+        <w:rPr>
+          <w:lang w:val="en-US"/>
+        </w:rPr>
+        <w:br/>
+      </w:r>
+      <w:proofErr w:type="spellStart"/>
+      <w:r>
+        <w:rPr>
+          <w:u w:val="single"/>
+          <w:lang w:val="en-US"/>
+        </w:rPr>
+        <w:t>Schedular</w:t>
+      </w:r>
+      <w:proofErr w:type="spellEnd"/>
+      <w:r>
+        <w:rPr>
+          <w:lang w:val="en-US"/>
+        </w:rPr>
+        <w:t xml:space="preserve"> – It is the component that decides where(on which node) </w:t>
+      </w:r>
+      <w:proofErr w:type="spellStart"/>
+      <w:r>
+        <w:rPr>
+          <w:lang w:val="en-US"/>
+        </w:rPr>
+        <w:t>a</w:t>
+      </w:r>
+      <w:proofErr w:type="spellEnd"/>
+      <w:r>
+        <w:rPr>
+          <w:lang w:val="en-US"/>
+        </w:rPr>
+        <w:t xml:space="preserve"> Pod should run.</w:t>
+      </w:r>
+      <w:r>
+        <w:rPr>
+          <w:lang w:val="en-US"/>
+        </w:rPr>
+        <w:br/>
+        <w:t xml:space="preserve">Kubernetes scheduler </w:t>
+      </w:r>
+      <w:r>
+        <w:rPr>
+          <w:lang w:val="en-US"/>
+        </w:rPr>
+        <w:t xml:space="preserve">is a </w:t>
+      </w:r>
+      <w:r>
+        <w:rPr>
+          <w:lang w:val="en-US"/>
+        </w:rPr>
+        <w:t>control plane component that assigns pods to the most suitable</w:t>
+      </w:r>
+      <w:r>
+        <w:rPr>
+          <w:lang w:val="en-US"/>
+        </w:rPr>
+        <w:t xml:space="preserve"> Nodes based on resources, constraints, and policies.</w:t>
+      </w:r>
+      <w:r>
+        <w:rPr>
+          <w:lang w:val="en-US"/>
+        </w:rPr>
+        <w:t xml:space="preserve"> </w:t>
+      </w:r>
+      <w:r>
+        <w:rPr>
+          <w:lang w:val="en-US"/>
+        </w:rPr>
+        <w:br/>
+      </w:r>
+      <w:proofErr w:type="spellStart"/>
+      <w:r>
+        <w:rPr>
+          <w:u w:val="single"/>
+          <w:lang w:val="en-US"/>
+        </w:rPr>
+        <w:t>etcd</w:t>
+      </w:r>
+      <w:proofErr w:type="spellEnd"/>
+      <w:r>
+        <w:rPr>
+          <w:lang w:val="en-US"/>
+        </w:rPr>
+        <w:t xml:space="preserve"> – </w:t>
+      </w:r>
+      <w:proofErr w:type="spellStart"/>
+      <w:r>
+        <w:rPr>
+          <w:lang w:val="en-US"/>
+        </w:rPr>
+        <w:t>etcd</w:t>
+      </w:r>
+      <w:proofErr w:type="spellEnd"/>
+      <w:r>
+        <w:rPr>
+          <w:lang w:val="en-US"/>
+        </w:rPr>
+        <w:t xml:space="preserve"> is </w:t>
+      </w:r>
+      <w:proofErr w:type="spellStart"/>
+      <w:r>
+        <w:rPr>
+          <w:lang w:val="en-US"/>
+        </w:rPr>
+        <w:t>a</w:t>
+      </w:r>
+      <w:proofErr w:type="spellEnd"/>
+      <w:r>
+        <w:rPr>
+          <w:lang w:val="en-US"/>
+        </w:rPr>
+        <w:t xml:space="preserve"> distributed key-value store that stores the complete state and configuration data of a </w:t>
+      </w:r>
+      <w:proofErr w:type="spellStart"/>
+      <w:r>
+        <w:rPr>
+          <w:lang w:val="en-US"/>
+        </w:rPr>
+        <w:t>kubernetes</w:t>
+      </w:r>
+      <w:proofErr w:type="spellEnd"/>
+      <w:r>
+        <w:rPr>
+          <w:lang w:val="en-US"/>
+        </w:rPr>
+        <w:t xml:space="preserve"> cluster. It stores pods, nodes, deployments, </w:t>
+      </w:r>
+      <w:proofErr w:type="spellStart"/>
+      <w:r>
+        <w:rPr>
+          <w:lang w:val="en-US"/>
+        </w:rPr>
+        <w:t>replicasets</w:t>
+      </w:r>
+      <w:proofErr w:type="spellEnd"/>
+      <w:r>
+        <w:rPr>
+          <w:lang w:val="en-US"/>
+        </w:rPr>
+        <w:t xml:space="preserve">, services, </w:t>
+      </w:r>
+      <w:proofErr w:type="spellStart"/>
+      <w:r>
+        <w:rPr>
+          <w:lang w:val="en-US"/>
+        </w:rPr>
+        <w:t>configmaps</w:t>
+      </w:r>
+      <w:proofErr w:type="spellEnd"/>
+      <w:r>
+        <w:rPr>
+          <w:lang w:val="en-US"/>
+        </w:rPr>
+        <w:t xml:space="preserve">, secrets, namespaces, cluster state and metadata. If </w:t>
+      </w:r>
+      <w:proofErr w:type="spellStart"/>
+      <w:r>
+        <w:rPr>
+          <w:lang w:val="en-US"/>
+        </w:rPr>
+        <w:t>etcd</w:t>
+      </w:r>
+      <w:proofErr w:type="spellEnd"/>
+      <w:r>
+        <w:rPr>
+          <w:lang w:val="en-US"/>
+        </w:rPr>
+        <w:t xml:space="preserve"> is lost -&gt; cluster is lost.</w:t>
+      </w:r>
+      <w:r>
+        <w:rPr>
+          <w:lang w:val="en-US"/>
+        </w:rPr>
+        <w:br/>
+      </w:r>
+      <w:r>
+        <w:rPr>
+          <w:u w:val="single"/>
+          <w:lang w:val="en-US"/>
+        </w:rPr>
+        <w:t>API Server</w:t>
+      </w:r>
+      <w:r>
+        <w:rPr>
+          <w:lang w:val="en-US"/>
+        </w:rPr>
+        <w:t>-</w:t>
+      </w:r>
+      <w:r>
+        <w:rPr>
+          <w:lang w:val="en-US"/>
+        </w:rPr>
+        <w:t xml:space="preserve"> </w:t>
+      </w:r>
+      <w:r>
+        <w:t>It</w:t>
+      </w:r>
+      <w:r>
+        <w:t xml:space="preserve"> is the central management component that validates, processes, and serves all REST API requests and acts as the communication hub of the cluster.</w:t>
+      </w:r>
+      <w:r>
+        <w:t xml:space="preserve"> </w:t>
+      </w:r>
+      <w:proofErr w:type="spellStart"/>
+      <w:r>
+        <w:rPr>
+          <w:rStyle w:val="HTMLCode"/>
+          <w:rFonts w:eastAsiaTheme="minorHAnsi"/>
+        </w:rPr>
+        <w:t>K</w:t>
+      </w:r>
+      <w:r>
+        <w:rPr>
+          <w:rStyle w:val="HTMLCode"/>
+          <w:rFonts w:eastAsiaTheme="minorHAnsi"/>
+        </w:rPr>
+        <w:t>ubectl</w:t>
+      </w:r>
+      <w:proofErr w:type="spellEnd"/>
+      <w:r>
+        <w:t xml:space="preserve">, UI dashboard, Controllers, </w:t>
+      </w:r>
+      <w:proofErr w:type="spellStart"/>
+      <w:r>
+        <w:t>Schedular</w:t>
+      </w:r>
+      <w:proofErr w:type="spellEnd"/>
+      <w:r>
+        <w:t xml:space="preserve"> </w:t>
+      </w:r>
+      <w:r>
+        <w:t>talks to API Server</w:t>
+      </w:r>
+      <w:r>
+        <w:t xml:space="preserve">, </w:t>
+      </w:r>
+      <w:r>
+        <w:t>API Server talks to</w:t>
+      </w:r>
+      <w:r>
+        <w:t>/with</w:t>
+      </w:r>
+      <w:r>
+        <w:t xml:space="preserve"> </w:t>
+      </w:r>
+      <w:proofErr w:type="spellStart"/>
+      <w:r>
+        <w:rPr>
+          <w:rStyle w:val="Strong"/>
+          <w:b w:val="0"/>
+        </w:rPr>
+        <w:t>etcd</w:t>
+      </w:r>
+      <w:proofErr w:type="spellEnd"/>
+      <w:r>
+        <w:rPr>
+          <w:rStyle w:val="Strong"/>
+          <w:b w:val="0"/>
+        </w:rPr>
+        <w:t>.</w:t>
+      </w:r>
+      <w:r>
+        <w:rPr>
+          <w:rStyle w:val="Strong"/>
+          <w:b w:val="0"/>
+        </w:rPr>
+        <w:br/>
+      </w:r>
+      <w:proofErr w:type="spellStart"/>
+      <w:r>
+        <w:rPr>
+          <w:u w:val="single"/>
+        </w:rPr>
+        <w:t>kubelet</w:t>
+      </w:r>
+      <w:proofErr w:type="spellEnd"/>
+      <w:r>
+        <w:t>-</w:t>
+      </w:r>
+      <w:r>
+        <w:t xml:space="preserve"> </w:t>
+      </w:r>
+      <w:r>
+        <w:t xml:space="preserve">It </w:t>
+      </w:r>
+      <w:r>
+        <w:t>is the node agent that ensures Pods assigned to a node are running and healthy as per the specifications provided by the Kubernetes API Server.</w:t>
+      </w:r>
+      <w:r>
+        <w:br/>
+      </w:r>
+      <w:r>
+        <w:rPr>
+          <w:u w:val="single"/>
+        </w:rPr>
+        <w:t>Service Proxy</w:t>
+      </w:r>
+      <w:r>
+        <w:rPr>
+          <w:lang w:val="en-US"/>
+        </w:rPr>
+        <w:t xml:space="preserve">- </w:t>
+      </w:r>
+      <w:proofErr w:type="spellStart"/>
+      <w:r>
+        <w:t>kube</w:t>
+      </w:r>
+      <w:proofErr w:type="spellEnd"/>
+      <w:r>
+        <w:t>-proxy is a Kubernetes networking component that impl</w:t>
       </w:r>
       <w:bookmarkStart w:id="0" w:name="_GoBack"/>
       <w:bookmarkEnd w:id="0"/>
-      <w:proofErr w:type="gramEnd"/>
+      <w:r>
+        <w:t>ements Service abstraction by routing and load-balancing traffic to the correct Pods.</w:t>
+      </w:r>
+      <w:r>
+        <w:rPr>
+          <w:lang w:val="en-US"/>
+        </w:rPr>
+        <w:br/>
+      </w:r>
+      <w:r>
+        <w:rPr>
+          <w:lang w:val="en-US"/>
+        </w:rPr>
+        <w:br/>
+      </w:r>
+      <w:r>
+        <w:rPr>
+          <w:lang w:val="en-US"/>
+        </w:rPr>
+        <w:br/>
+      </w:r>
+      <w:r>
+        <w:rPr>
+          <w:lang w:val="en-US"/>
+        </w:rPr>
+        <w:br/>
+        <w:t>----------------------------     END - -------------------------</w:t>
+      </w:r>
     </w:p>
     <w:sectPr>
       <w:pgSz w:w="11906" w:h="16838"/>
@@ -589,6 +1056,30 @@
     <w:semiHidden/>
     <w:unhideWhenUsed/>
   </w:style>
+  <w:style w:type="character" w:styleId="HTMLCode">
+    <w:name w:val="HTML Code"/>
+    <w:basedOn w:val="DefaultParagraphFont"/>
+    <w:uiPriority w:val="99"/>
+    <w:semiHidden/>
+    <w:unhideWhenUsed/>
+    <w:rsid w:val="00AF0A63"/>
+    <w:rPr>
+      <w:rFonts w:ascii="Courier New" w:eastAsia="Times New Roman" w:hAnsi="Courier New" w:cs="Courier New"/>
+      <w:sz w:val="20"/>
+      <w:szCs w:val="20"/>
+    </w:rPr>
+  </w:style>
+  <w:style w:type="character" w:styleId="Strong">
+    <w:name w:val="Strong"/>
+    <w:basedOn w:val="DefaultParagraphFont"/>
+    <w:uiPriority w:val="22"/>
+    <w:qFormat/>
+    <w:rsid w:val="00AF0A63"/>
+    <w:rPr>
+      <w:b/>
+      <w:bCs/>
+    </w:rPr>
+  </w:style>
 </w:styles>
 </file>
 

</xml_diff>